<commit_message>
Stage 14: refresh JPET QA candidate artifacts
</commit_message>
<xml_diff>
--- a/Title_Page.docx
+++ b/Title_Page.docx
@@ -1,160 +1,160 @@
 
 <file path=word/document.xml><?xml version="1.0" encoding="utf-8"?>
-<w:document xmlns:wpc="http://schemas.microsoft.com/office/word/2010/wordprocessingCanvas" xmlns:mo="http://schemas.microsoft.com/office/mac/office/2008/main" xmlns:mc="http://schemas.openxmlformats.org/markup-compatibility/2006" xmlns:mv="urn:schemas-microsoft-com:mac:vml" xmlns:o="urn:schemas-microsoft-com:office:office" xmlns:r="http://schemas.openxmlformats.org/officeDocument/2006/relationships" xmlns:m="http://schemas.openxmlformats.org/officeDocument/2006/math" xmlns:v="urn:schemas-microsoft-com:vml" xmlns:wp14="http://schemas.microsoft.com/office/word/2010/wordprocessingDrawing" xmlns:wp="http://schemas.openxmlformats.org/drawingml/2006/wordprocessingDrawing" xmlns:w10="urn:schemas-microsoft-com:office:word" xmlns:w="http://schemas.openxmlformats.org/wordprocessingml/2006/main" xmlns:w14="http://schemas.microsoft.com/office/word/2010/wordml" xmlns:wpg="http://schemas.microsoft.com/office/word/2010/wordprocessingGroup" xmlns:wpi="http://schemas.microsoft.com/office/word/2010/wordprocessingInk" xmlns:wne="http://schemas.microsoft.com/office/word/2006/wordml" xmlns:wps="http://schemas.microsoft.com/office/word/2010/wordprocessingShape" mc:Ignorable="w14 wp14">
-  <w:body>
-    <w:p>
-      <w:pPr>
-        <w:spacing w:after="360"/>
-        <w:jc w:val="center"/>
-      </w:pPr>
-      <w:r>
-        <w:rPr>
-          <w:rFonts w:ascii="Times New Roman" w:hAnsi="Times New Roman" w:eastAsia="Times New Roman"/>
-          <w:b/>
-          <w:sz w:val="32"/>
-        </w:rPr>
-        <w:t>Public Co-Creation Hubs, Cross-Regional Pipelines, and Dynamic Efficiency in Thin Regional Ecosystems</w:t>
-      </w:r>
-    </w:p>
-    <w:p>
-      <w:pPr>
-        <w:spacing w:before="120" w:after="40"/>
-      </w:pPr>
-      <w:r>
-        <w:rPr>
-          <w:rFonts w:ascii="Times New Roman" w:hAnsi="Times New Roman" w:eastAsia="Times New Roman"/>
-          <w:b/>
-          <w:sz w:val="24"/>
-        </w:rPr>
-        <w:t>Author</w:t>
-      </w:r>
-    </w:p>
-    <w:p>
-      <w:pPr>
-        <w:spacing w:after="200" w:line="276" w:lineRule="auto"/>
-      </w:pPr>
-      <w:r>
-        <w:rPr>
-          <w:rFonts w:ascii="Times New Roman" w:hAnsi="Times New Roman" w:eastAsia="Times New Roman"/>
-          <w:sz w:val="24"/>
-        </w:rPr>
-        <w:t>Ryota Matsuki</w:t>
-      </w:r>
-    </w:p>
-    <w:p>
-      <w:pPr>
-        <w:spacing w:before="120" w:after="40"/>
-      </w:pPr>
-      <w:r>
-        <w:rPr>
-          <w:rFonts w:ascii="Times New Roman" w:hAnsi="Times New Roman" w:eastAsia="Times New Roman"/>
-          <w:b/>
-          <w:sz w:val="24"/>
-        </w:rPr>
-        <w:t>Affiliation</w:t>
-      </w:r>
-    </w:p>
-    <w:p>
-      <w:pPr>
-        <w:spacing w:after="200" w:line="276" w:lineRule="auto"/>
-      </w:pPr>
-      <w:r>
-        <w:rPr>
-          <w:rFonts w:ascii="Times New Roman" w:hAnsi="Times New Roman" w:eastAsia="Times New Roman"/>
-          <w:sz w:val="24"/>
-        </w:rPr>
-        <w:t>Independent Researcher, Matsuyama, Ehime, Japan</w:t>
-      </w:r>
-    </w:p>
-    <w:p>
-      <w:pPr>
-        <w:spacing w:before="120" w:after="40"/>
-      </w:pPr>
-      <w:r>
-        <w:rPr>
-          <w:rFonts w:ascii="Times New Roman" w:hAnsi="Times New Roman" w:eastAsia="Times New Roman"/>
-          <w:b/>
-          <w:sz w:val="24"/>
-        </w:rPr>
-        <w:t>Address for Correspondence</w:t>
-      </w:r>
-    </w:p>
-    <w:p>
-      <w:pPr>
-        <w:spacing w:after="200" w:line="276" w:lineRule="auto"/>
-      </w:pPr>
-      <w:r>
-        <w:rPr>
-          <w:rFonts w:ascii="Times New Roman" w:hAnsi="Times New Roman" w:eastAsia="Times New Roman"/>
-          <w:sz w:val="24"/>
-        </w:rPr>
-        <w:t>Ryota Matsuki</w:t>
-        <w:br/>
-        <w:t>Independent Researcher</w:t>
-        <w:br/>
-        <w:t>Matsuyama, Ehime, Japan</w:t>
-        <w:br/>
-        <w:t>Email: ryota.matsuki@gmail.com</w:t>
-      </w:r>
-    </w:p>
-    <w:p>
-      <w:pPr>
-        <w:spacing w:before="120" w:after="40"/>
-      </w:pPr>
-      <w:r>
-        <w:rPr>
-          <w:rFonts w:ascii="Times New Roman" w:hAnsi="Times New Roman" w:eastAsia="Times New Roman"/>
-          <w:b/>
-          <w:sz w:val="24"/>
-        </w:rPr>
-        <w:t>Acknowledgements</w:t>
-      </w:r>
-    </w:p>
-    <w:p>
-      <w:pPr>
-        <w:spacing w:after="200" w:line="276" w:lineRule="auto"/>
-      </w:pPr>
-      <w:r>
-        <w:rPr>
-          <w:rFonts w:ascii="Times New Roman" w:hAnsi="Times New Roman" w:eastAsia="Times New Roman"/>
-          <w:sz w:val="24"/>
-        </w:rPr>
-        <w:t>During the preparation of this manuscript, the author used ChatGPT (OpenAI) to assist with drafting selected passages, refining substantive exposition, and exploring analytical implications of the theoretical framework. The author independently reviewed and verified all arguments and results and assumes full responsibility for the manuscript’s accuracy, interpretation, and content.</w:t>
-      </w:r>
-    </w:p>
-    <w:p>
-      <w:pPr>
-        <w:spacing w:before="120" w:after="40"/>
-      </w:pPr>
-      <w:r>
-        <w:rPr>
-          <w:rFonts w:ascii="Times New Roman" w:hAnsi="Times New Roman" w:eastAsia="Times New Roman"/>
-          <w:b/>
-          <w:sz w:val="24"/>
-        </w:rPr>
-        <w:t>Conflict of Interest Statement</w:t>
-      </w:r>
-    </w:p>
-    <w:p>
-      <w:pPr>
-        <w:spacing w:after="200" w:line="276" w:lineRule="auto"/>
-      </w:pPr>
-      <w:r>
-        <w:rPr>
-          <w:rFonts w:ascii="Times New Roman" w:hAnsi="Times New Roman" w:eastAsia="Times New Roman"/>
-          <w:sz w:val="24"/>
-        </w:rPr>
-        <w:t>The author declares no conflict of interest.</w:t>
-      </w:r>
-    </w:p>
-    <w:sectPr>
-      <w:pgSz w:w="12240" w:h="15840"/>
-      <w:pgMar w:top="1440" w:right="1440" w:bottom="1440" w:left="1440" w:header="720" w:footer="720" w:gutter="0"/>
-      <w:cols w:space="720"/>
-      <w:docGrid w:linePitch="360"/>
-    </w:sectPr>
-  </w:body>
-</w:document>
+<ns0:document xmlns:ns0="http://schemas.openxmlformats.org/wordprocessingml/2006/main" xmlns:ns1="http://schemas.openxmlformats.org/markup-compatibility/2006" ns1:Ignorable="w14 wp14">
+  <ns0:body>
+    <ns0:p>
+      <ns0:pPr>
+        <ns0:spacing ns0:after="360"/>
+        <ns0:jc ns0:val="center"/>
+      </ns0:pPr>
+      <ns0:r>
+        <ns0:rPr>
+          <ns0:rFonts ns0:ascii="Times New Roman" ns0:hAnsi="Times New Roman" ns0:eastAsia="Times New Roman"/>
+          <ns0:b/>
+          <ns0:sz ns0:val="32"/>
+        </ns0:rPr>
+        <ns0:t>Strategic Interaction among Public Innovation Hubs under Private Repricing</ns0:t>
+      </ns0:r>
+    </ns0:p>
+    <ns0:p>
+      <ns0:pPr>
+        <ns0:spacing ns0:before="120" ns0:after="40"/>
+      </ns0:pPr>
+      <ns0:r>
+        <ns0:rPr>
+          <ns0:rFonts ns0:ascii="Times New Roman" ns0:hAnsi="Times New Roman" ns0:eastAsia="Times New Roman"/>
+          <ns0:b/>
+          <ns0:sz ns0:val="24"/>
+        </ns0:rPr>
+        <ns0:t>Author</ns0:t>
+      </ns0:r>
+    </ns0:p>
+    <ns0:p>
+      <ns0:pPr>
+        <ns0:spacing ns0:after="200" ns0:line="276" ns0:lineRule="auto"/>
+      </ns0:pPr>
+      <ns0:r>
+        <ns0:rPr>
+          <ns0:rFonts ns0:ascii="Times New Roman" ns0:hAnsi="Times New Roman" ns0:eastAsia="Times New Roman"/>
+          <ns0:sz ns0:val="24"/>
+        </ns0:rPr>
+        <ns0:t>Ryota Matsuki</ns0:t>
+      </ns0:r>
+    </ns0:p>
+    <ns0:p>
+      <ns0:pPr>
+        <ns0:spacing ns0:before="120" ns0:after="40"/>
+      </ns0:pPr>
+      <ns0:r>
+        <ns0:rPr>
+          <ns0:rFonts ns0:ascii="Times New Roman" ns0:hAnsi="Times New Roman" ns0:eastAsia="Times New Roman"/>
+          <ns0:b/>
+          <ns0:sz ns0:val="24"/>
+        </ns0:rPr>
+        <ns0:t>Affiliation</ns0:t>
+      </ns0:r>
+    </ns0:p>
+    <ns0:p>
+      <ns0:pPr>
+        <ns0:spacing ns0:after="200" ns0:line="276" ns0:lineRule="auto"/>
+      </ns0:pPr>
+      <ns0:r>
+        <ns0:rPr>
+          <ns0:rFonts ns0:ascii="Times New Roman" ns0:hAnsi="Times New Roman" ns0:eastAsia="Times New Roman"/>
+          <ns0:sz ns0:val="24"/>
+        </ns0:rPr>
+        <ns0:t>Independent Researcher, Matsuyama, Ehime, Japan</ns0:t>
+      </ns0:r>
+    </ns0:p>
+    <ns0:p>
+      <ns0:pPr>
+        <ns0:spacing ns0:before="120" ns0:after="40"/>
+      </ns0:pPr>
+      <ns0:r>
+        <ns0:rPr>
+          <ns0:rFonts ns0:ascii="Times New Roman" ns0:hAnsi="Times New Roman" ns0:eastAsia="Times New Roman"/>
+          <ns0:b/>
+          <ns0:sz ns0:val="24"/>
+        </ns0:rPr>
+        <ns0:t>Address for Correspondence</ns0:t>
+      </ns0:r>
+    </ns0:p>
+    <ns0:p>
+      <ns0:pPr>
+        <ns0:spacing ns0:after="200" ns0:line="276" ns0:lineRule="auto"/>
+      </ns0:pPr>
+      <ns0:r>
+        <ns0:rPr>
+          <ns0:rFonts ns0:ascii="Times New Roman" ns0:hAnsi="Times New Roman" ns0:eastAsia="Times New Roman"/>
+          <ns0:sz ns0:val="24"/>
+        </ns0:rPr>
+        <ns0:t>Ryota Matsuki</ns0:t>
+        <ns0:br/>
+        <ns0:t>Independent Researcher</ns0:t>
+        <ns0:br/>
+        <ns0:t>Matsuyama, Ehime, Japan</ns0:t>
+        <ns0:br/>
+        <ns0:t>Email: ryota.matsuki@gmail.com</ns0:t>
+      </ns0:r>
+    </ns0:p>
+    <ns0:p>
+      <ns0:pPr>
+        <ns0:spacing ns0:before="120" ns0:after="40"/>
+      </ns0:pPr>
+      <ns0:r>
+        <ns0:rPr>
+          <ns0:rFonts ns0:ascii="Times New Roman" ns0:hAnsi="Times New Roman" ns0:eastAsia="Times New Roman"/>
+          <ns0:b/>
+          <ns0:sz ns0:val="24"/>
+        </ns0:rPr>
+        <ns0:t>Acknowledgements</ns0:t>
+      </ns0:r>
+    </ns0:p>
+    <ns0:p>
+      <ns0:pPr>
+        <ns0:spacing ns0:after="200" ns0:line="276" ns0:lineRule="auto"/>
+      </ns0:pPr>
+      <ns0:r>
+        <ns0:rPr>
+          <ns0:rFonts ns0:ascii="Times New Roman" ns0:hAnsi="Times New Roman" ns0:eastAsia="Times New Roman"/>
+          <ns0:sz ns0:val="24"/>
+        </ns0:rPr>
+        <ns0:t>During the preparation of this manuscript, the author used ChatGPT (OpenAI) to assist with drafting selected passages, refining substantive exposition, and exploring analytical implications of the theoretical framework. The author independently reviewed and verified all arguments and results and assumes full responsibility for the manuscript’s accuracy, interpretation, and content.</ns0:t>
+      </ns0:r>
+    </ns0:p>
+    <ns0:p>
+      <ns0:pPr>
+        <ns0:spacing ns0:before="120" ns0:after="40"/>
+      </ns0:pPr>
+      <ns0:r>
+        <ns0:rPr>
+          <ns0:rFonts ns0:ascii="Times New Roman" ns0:hAnsi="Times New Roman" ns0:eastAsia="Times New Roman"/>
+          <ns0:b/>
+          <ns0:sz ns0:val="24"/>
+        </ns0:rPr>
+        <ns0:t>Conflict of Interest Statement</ns0:t>
+      </ns0:r>
+    </ns0:p>
+    <ns0:p>
+      <ns0:pPr>
+        <ns0:spacing ns0:after="200" ns0:line="276" ns0:lineRule="auto"/>
+      </ns0:pPr>
+      <ns0:r>
+        <ns0:rPr>
+          <ns0:rFonts ns0:ascii="Times New Roman" ns0:hAnsi="Times New Roman" ns0:eastAsia="Times New Roman"/>
+          <ns0:sz ns0:val="24"/>
+        </ns0:rPr>
+        <ns0:t>The author declares no conflict of interest.</ns0:t>
+      </ns0:r>
+    </ns0:p>
+    <ns0:sectPr ns0:rsidR="00FC693F" ns0:rsidRPr="0006063C" ns0:rsidSect="00034616">
+      <ns0:pgSz ns0:w="12240" ns0:h="15840"/>
+      <ns0:pgMar ns0:top="1440" ns0:right="1440" ns0:bottom="1440" ns0:left="1440" ns0:header="720" ns0:footer="720" ns0:gutter="0"/>
+      <ns0:cols ns0:space="720"/>
+      <ns0:docGrid ns0:linePitch="360"/>
+    </ns0:sectPr>
+  </ns0:body>
+</ns0:document>
 </file>
 
 <file path=word/numbering.xml><?xml version="1.0" encoding="utf-8"?>

</xml_diff>